<commit_message>
Synchronize technical documentation with remediation
</commit_message>
<xml_diff>
--- a/docs/CASLA_Mobile_Technical_Documentation.docx
+++ b/docs/CASLA_Mobile_Technical_Documentation.docx
@@ -3480,7 +3480,7 @@
           <w:color w:val="9B1C1C"/>
           <w:sz w:val="22"/>
         </w:rPr>
-        <w:t>Sai lệch cần xử lý: predicate hiện chỉ enforce tối thiểu 6 ký tự và không chứa username, trong khi error text createUser mô tả policy 12 ký tự gồm hoa/thường/số. Message không phải enforcement; nếu thay policy phải sửa predicate, message, migration và test đồng bộ.</w:t>
+        <w:t>Policy hiện hành: mật khẩu phải dài tối thiểu 6 ký tự và không chứa username. Predicate và message của createUser/changePasswordAdmin đã được đồng bộ theo policy này. Nếu nâng policy, phải thay predicate, message, migration và ABAP Unit/test integration cùng một lần.</w:t>
       </w:r>
     </w:p>
     <w:p>
@@ -9042,7 +9042,7 @@
           <w:color w:val="17231F"/>
           <w:sz w:val="22"/>
         </w:rPr>
-        <w:t>Workflow .github/workflows/abaplint.yml chạy ABAP Cloud syntax/check/DDIC/complexity và các pattern RAP. Repository ghi nhận lần chạy gần nhất: @abaplint/cli 2.120.35, 0 issue(s), 241 file(s) analyzed.</w:t>
+        <w:t>Workflow .github/workflows/abaplint.yml chạy custom RAP checks và @abaplint/cli 2.120.35 cho ABAP Cloud. Chạy local bằng bash scripts/check_ci.sh; CI phải xanh. Không ghi cố định số issue/file vì snapshot thay đổi theo source.</w:t>
       </w:r>
     </w:p>
     <w:p>

</xml_diff>

<commit_message>
Synchronize documentation object counts
</commit_message>
<xml_diff>
--- a/docs/CASLA_Mobile_Technical_Documentation.docx
+++ b/docs/CASLA_Mobile_Technical_Documentation.docx
@@ -887,14 +887,15 @@
             <w:pPr>
               <w:spacing w:after="0" w:line="276" w:lineRule="auto"/>
             </w:pPr>
-            <w:r/>
+            <w:r>
+              <w:t>318</w:t>
+            </w:r>
             <w:r>
               <w:rPr>
                 <w:rFonts w:ascii="Calibri" w:hAnsi="Calibri"/>
                 <w:color w:val="17231F"/>
                 <w:sz w:val="18"/>
               </w:rPr>
-              <w:t>315</w:t>
             </w:r>
           </w:p>
         </w:tc>

</xml_diff>

<commit_message>
Fix ABAP CI gate and harden RAP quality checks
- fix changePasswordAdmin RAP handler signature and contract cleanup
- align password policy messaging with enforcement
- configure method_length by statements and refactor login session revocation
- remove broad locals_imp unused-variable exclusion and honor RAP authorization request masks
- version RAP checks behind a single local/CI command
- add initial ABAP Unit coverage for hashing and token/KDF guards
- synchronize README, remediation status, and technical DOCX
</commit_message>
<xml_diff>
--- a/docs/CASLA_Mobile_Technical_Documentation.docx
+++ b/docs/CASLA_Mobile_Technical_Documentation.docx
@@ -887,14 +887,15 @@
             <w:pPr>
               <w:spacing w:after="0" w:line="276" w:lineRule="auto"/>
             </w:pPr>
-            <w:r/>
+            <w:r>
+              <w:t>318</w:t>
+            </w:r>
             <w:r>
               <w:rPr>
                 <w:rFonts w:ascii="Calibri" w:hAnsi="Calibri"/>
                 <w:color w:val="17231F"/>
                 <w:sz w:val="18"/>
               </w:rPr>
-              <w:t>315</w:t>
             </w:r>
           </w:p>
         </w:tc>
@@ -3480,7 +3481,7 @@
           <w:color w:val="9B1C1C"/>
           <w:sz w:val="22"/>
         </w:rPr>
-        <w:t>Sai lệch cần xử lý: predicate hiện chỉ enforce tối thiểu 6 ký tự và không chứa username, trong khi error text createUser mô tả policy 12 ký tự gồm hoa/thường/số. Message không phải enforcement; nếu thay policy phải sửa predicate, message, migration và test đồng bộ.</w:t>
+        <w:t>Policy hiện hành: mật khẩu phải dài tối thiểu 6 ký tự và không chứa username. Predicate và message của createUser/changePasswordAdmin đã được đồng bộ theo policy này. Nếu nâng policy, phải thay predicate, message, migration và ABAP Unit/test integration cùng một lần.</w:t>
       </w:r>
     </w:p>
     <w:p>
@@ -9042,7 +9043,7 @@
           <w:color w:val="17231F"/>
           <w:sz w:val="22"/>
         </w:rPr>
-        <w:t>Workflow .github/workflows/abaplint.yml chạy ABAP Cloud syntax/check/DDIC/complexity và các pattern RAP. Repository ghi nhận lần chạy gần nhất: @abaplint/cli 2.120.35, 0 issue(s), 241 file(s) analyzed.</w:t>
+        <w:t>Workflow .github/workflows/abaplint.yml chạy custom RAP checks và @abaplint/cli 2.120.35 cho ABAP Cloud. Chạy local bằng bash scripts/check_ci.sh; CI phải xanh. Không ghi cố định số issue/file vì snapshot thay đổi theo source.</w:t>
       </w:r>
     </w:p>
     <w:p>

</xml_diff>